<commit_message>
Module 07: rules R33-R41 enforced - nine policy branches, gate blocks 1b-1d (launch refused for R33/R35/R36/R41, reading for R37, push/deletion line for R39/R40), R27 in the reading branch (the repeat bug the S13/S14 baseline exposed); test_gate_v2.py (12, negative control per check), 29 tests green; replay 17/17; rules_v2.json the default (v1 loads); notebook (19 cells) and report rebuilt; README/DESIGN/checklist/PROVENANCE; TASKS + ledger
Co-Authored-By: Claude Fable 5.1 <noreply@anthropic.com>
</commit_message>
<xml_diff>
--- a/plans/05_delta-probed-ir-pipeline/modules/07_agentic_workflows/Agentic_AI_System_Design_Report.docx
+++ b/plans/05_delta-probed-ir-pipeline/modules/07_agentic_workflows/Agentic_AI_System_Design_Report.docx
@@ -70,7 +70,7 @@
           <w:b w:val="0"/>
           <w:i w:val="0"/>
         </w:rPr>
-        <w:t>2026-09-25</w:t>
+        <w:t>2026-10-03</w:t>
       </w:r>
     </w:p>
     <w:p>
@@ -125,7 +125,7 @@
           <w:b w:val="0"/>
           <w:i w:val="0"/>
         </w:rPr>
-        <w:t>Components. The persona is a careful laboratory technician who applies written rules and escalates what matches no rule. The reasoning loop is observe → propose → gate → act → record, with a conditional edge back to observe until a terminal action (wait or escalate) or a step budget. Memory has three parts: a curated long-term rule table of 32 rules (22 enforced mechanically by the gate, the rest shaping the reasoning prompt), a campaign state, and a rolling window of observations and actions taken in the run. Tools are the project's own status reader, launcher, result readers, ledger and notification channel, wrapped behind an interface whose replay implementation substitutes log fixtures for machines. The design follows the reasoning-and-acting pattern of ReAct (Yao et al., 2023) and the tool-use framing of Toolformer (Schick et al., 2023), with one deliberate departure: the model never executes; it proposes a structured object {action, args, rule_id, reason} and plain code decides. Figure 1 shows the graph; the notebook draws it from the compiled LangGraph object.</w:t>
+        <w:t>Components. The persona is a careful laboratory technician who applies written rules and escalates what matches no rule. The reasoning loop is observe → propose → gate → act → record, with a conditional edge back to observe until a terminal action (wait or escalate) or a step budget. Memory has three parts: a curated long-term rule table of 41 rules (29 enforced mechanically by the gate, the rest shaping the reasoning prompt), a campaign state, and a rolling window of observations and actions taken in the run. Tools are the project's own status reader, launcher, result readers, ledger and notification channel, wrapped behind an interface whose replay implementation substitutes log fixtures for machines. The design follows the reasoning-and-acting pattern of ReAct (Yao et al., 2023) and the tool-use framing of Toolformer (Schick et al., 2023), with one deliberate departure: the model never executes; it proposes a structured object {action, args, rule_id, reason} and plain code decides. Figure 1 shows the graph; the notebook draws it from the compiled LangGraph object.</w:t>
       </w:r>
     </w:p>
     <w:p>
@@ -220,7 +220,7 @@
           <w:i/>
           <w:sz w:val="20"/>
         </w:rPr>
-        <w:t>Table 1. The eight pre-registered scenarios (real log excerpts of 25 September 2026) replayed with the deterministic reference policy: 8 of 8 correct.</w:t>
+        <w:t>Table 1. The 17 pre-registered scenarios (S1–S8: real log excerpts of 25 September 2026; S9–S17: the records of 27 September – 3 October) replayed with the deterministic reference policy: 17 of 17 correct.</w:t>
       </w:r>
     </w:p>
     <w:tbl>
@@ -703,6 +703,474 @@
           </w:p>
         </w:tc>
       </w:tr>
+      <w:tr>
+        <w:tc>
+          <w:tcPr>
+            <w:tcW w:type="dxa" w:w="1872"/>
+          </w:tcPr>
+          <w:p>
+            <w:r>
+              <w:t>S9</w:t>
+            </w:r>
+          </w:p>
+        </w:tc>
+        <w:tc>
+          <w:tcPr>
+            <w:tcW w:type="dxa" w:w="1872"/>
+          </w:tcPr>
+          <w:p>
+            <w:r>
+              <w:t>escalate_to_human</w:t>
+            </w:r>
+          </w:p>
+        </w:tc>
+        <w:tc>
+          <w:tcPr>
+            <w:tcW w:type="dxa" w:w="1872"/>
+          </w:tcPr>
+          <w:p>
+            <w:r>
+              <w:t>R33</w:t>
+            </w:r>
+          </w:p>
+        </w:tc>
+        <w:tc>
+          <w:tcPr>
+            <w:tcW w:type="dxa" w:w="1872"/>
+          </w:tcPr>
+          <w:p>
+            <w:r>
+              <w:t>—</w:t>
+            </w:r>
+          </w:p>
+        </w:tc>
+        <w:tc>
+          <w:tcPr>
+            <w:tcW w:type="dxa" w:w="1872"/>
+          </w:tcPr>
+          <w:p>
+            <w:r>
+              <w:t>yes</w:t>
+            </w:r>
+          </w:p>
+        </w:tc>
+      </w:tr>
+      <w:tr>
+        <w:tc>
+          <w:tcPr>
+            <w:tcW w:type="dxa" w:w="1872"/>
+          </w:tcPr>
+          <w:p>
+            <w:r>
+              <w:t>S10</w:t>
+            </w:r>
+          </w:p>
+        </w:tc>
+        <w:tc>
+          <w:tcPr>
+            <w:tcW w:type="dxa" w:w="1872"/>
+          </w:tcPr>
+          <w:p>
+            <w:r>
+              <w:t>escalate_to_human</w:t>
+            </w:r>
+          </w:p>
+        </w:tc>
+        <w:tc>
+          <w:tcPr>
+            <w:tcW w:type="dxa" w:w="1872"/>
+          </w:tcPr>
+          <w:p>
+            <w:r>
+              <w:t>R34</w:t>
+            </w:r>
+          </w:p>
+        </w:tc>
+        <w:tc>
+          <w:tcPr>
+            <w:tcW w:type="dxa" w:w="1872"/>
+          </w:tcPr>
+          <w:p>
+            <w:r>
+              <w:t>—</w:t>
+            </w:r>
+          </w:p>
+        </w:tc>
+        <w:tc>
+          <w:tcPr>
+            <w:tcW w:type="dxa" w:w="1872"/>
+          </w:tcPr>
+          <w:p>
+            <w:r>
+              <w:t>yes</w:t>
+            </w:r>
+          </w:p>
+        </w:tc>
+      </w:tr>
+      <w:tr>
+        <w:tc>
+          <w:tcPr>
+            <w:tcW w:type="dxa" w:w="1872"/>
+          </w:tcPr>
+          <w:p>
+            <w:r>
+              <w:t>S11</w:t>
+            </w:r>
+          </w:p>
+        </w:tc>
+        <w:tc>
+          <w:tcPr>
+            <w:tcW w:type="dxa" w:w="1872"/>
+          </w:tcPr>
+          <w:p>
+            <w:r>
+              <w:t>escalate_to_human</w:t>
+            </w:r>
+          </w:p>
+        </w:tc>
+        <w:tc>
+          <w:tcPr>
+            <w:tcW w:type="dxa" w:w="1872"/>
+          </w:tcPr>
+          <w:p>
+            <w:r>
+              <w:t>R35</w:t>
+            </w:r>
+          </w:p>
+        </w:tc>
+        <w:tc>
+          <w:tcPr>
+            <w:tcW w:type="dxa" w:w="1872"/>
+          </w:tcPr>
+          <w:p>
+            <w:r>
+              <w:t>—</w:t>
+            </w:r>
+          </w:p>
+        </w:tc>
+        <w:tc>
+          <w:tcPr>
+            <w:tcW w:type="dxa" w:w="1872"/>
+          </w:tcPr>
+          <w:p>
+            <w:r>
+              <w:t>yes</w:t>
+            </w:r>
+          </w:p>
+        </w:tc>
+      </w:tr>
+      <w:tr>
+        <w:tc>
+          <w:tcPr>
+            <w:tcW w:type="dxa" w:w="1872"/>
+          </w:tcPr>
+          <w:p>
+            <w:r>
+              <w:t>S12</w:t>
+            </w:r>
+          </w:p>
+        </w:tc>
+        <w:tc>
+          <w:tcPr>
+            <w:tcW w:type="dxa" w:w="1872"/>
+          </w:tcPr>
+          <w:p>
+            <w:r>
+              <w:t>escalate_to_human</w:t>
+            </w:r>
+          </w:p>
+        </w:tc>
+        <w:tc>
+          <w:tcPr>
+            <w:tcW w:type="dxa" w:w="1872"/>
+          </w:tcPr>
+          <w:p>
+            <w:r>
+              <w:t>R36</w:t>
+            </w:r>
+          </w:p>
+        </w:tc>
+        <w:tc>
+          <w:tcPr>
+            <w:tcW w:type="dxa" w:w="1872"/>
+          </w:tcPr>
+          <w:p>
+            <w:r>
+              <w:t>—</w:t>
+            </w:r>
+          </w:p>
+        </w:tc>
+        <w:tc>
+          <w:tcPr>
+            <w:tcW w:type="dxa" w:w="1872"/>
+          </w:tcPr>
+          <w:p>
+            <w:r>
+              <w:t>yes</w:t>
+            </w:r>
+          </w:p>
+        </w:tc>
+      </w:tr>
+      <w:tr>
+        <w:tc>
+          <w:tcPr>
+            <w:tcW w:type="dxa" w:w="1872"/>
+          </w:tcPr>
+          <w:p>
+            <w:r>
+              <w:t>S13</w:t>
+            </w:r>
+          </w:p>
+        </w:tc>
+        <w:tc>
+          <w:tcPr>
+            <w:tcW w:type="dxa" w:w="1872"/>
+          </w:tcPr>
+          <w:p>
+            <w:r>
+              <w:t>escalate_to_human</w:t>
+            </w:r>
+          </w:p>
+        </w:tc>
+        <w:tc>
+          <w:tcPr>
+            <w:tcW w:type="dxa" w:w="1872"/>
+          </w:tcPr>
+          <w:p>
+            <w:r>
+              <w:t>R37</w:t>
+            </w:r>
+          </w:p>
+        </w:tc>
+        <w:tc>
+          <w:tcPr>
+            <w:tcW w:type="dxa" w:w="1872"/>
+          </w:tcPr>
+          <w:p>
+            <w:r>
+              <w:t>—</w:t>
+            </w:r>
+          </w:p>
+        </w:tc>
+        <w:tc>
+          <w:tcPr>
+            <w:tcW w:type="dxa" w:w="1872"/>
+          </w:tcPr>
+          <w:p>
+            <w:r>
+              <w:t>yes</w:t>
+            </w:r>
+          </w:p>
+        </w:tc>
+      </w:tr>
+      <w:tr>
+        <w:tc>
+          <w:tcPr>
+            <w:tcW w:type="dxa" w:w="1872"/>
+          </w:tcPr>
+          <w:p>
+            <w:r>
+              <w:t>S14</w:t>
+            </w:r>
+          </w:p>
+        </w:tc>
+        <w:tc>
+          <w:tcPr>
+            <w:tcW w:type="dxa" w:w="1872"/>
+          </w:tcPr>
+          <w:p>
+            <w:r>
+              <w:t>escalate_to_human</w:t>
+            </w:r>
+          </w:p>
+        </w:tc>
+        <w:tc>
+          <w:tcPr>
+            <w:tcW w:type="dxa" w:w="1872"/>
+          </w:tcPr>
+          <w:p>
+            <w:r>
+              <w:t>R38</w:t>
+            </w:r>
+          </w:p>
+        </w:tc>
+        <w:tc>
+          <w:tcPr>
+            <w:tcW w:type="dxa" w:w="1872"/>
+          </w:tcPr>
+          <w:p>
+            <w:r>
+              <w:t>—</w:t>
+            </w:r>
+          </w:p>
+        </w:tc>
+        <w:tc>
+          <w:tcPr>
+            <w:tcW w:type="dxa" w:w="1872"/>
+          </w:tcPr>
+          <w:p>
+            <w:r>
+              <w:t>yes</w:t>
+            </w:r>
+          </w:p>
+        </w:tc>
+      </w:tr>
+      <w:tr>
+        <w:tc>
+          <w:tcPr>
+            <w:tcW w:type="dxa" w:w="1872"/>
+          </w:tcPr>
+          <w:p>
+            <w:r>
+              <w:t>S15</w:t>
+            </w:r>
+          </w:p>
+        </w:tc>
+        <w:tc>
+          <w:tcPr>
+            <w:tcW w:type="dxa" w:w="1872"/>
+          </w:tcPr>
+          <w:p>
+            <w:r>
+              <w:t>escalate_to_human</w:t>
+            </w:r>
+          </w:p>
+        </w:tc>
+        <w:tc>
+          <w:tcPr>
+            <w:tcW w:type="dxa" w:w="1872"/>
+          </w:tcPr>
+          <w:p>
+            <w:r>
+              <w:t>R39</w:t>
+            </w:r>
+          </w:p>
+        </w:tc>
+        <w:tc>
+          <w:tcPr>
+            <w:tcW w:type="dxa" w:w="1872"/>
+          </w:tcPr>
+          <w:p>
+            <w:r>
+              <w:t>—</w:t>
+            </w:r>
+          </w:p>
+        </w:tc>
+        <w:tc>
+          <w:tcPr>
+            <w:tcW w:type="dxa" w:w="1872"/>
+          </w:tcPr>
+          <w:p>
+            <w:r>
+              <w:t>yes</w:t>
+            </w:r>
+          </w:p>
+        </w:tc>
+      </w:tr>
+      <w:tr>
+        <w:tc>
+          <w:tcPr>
+            <w:tcW w:type="dxa" w:w="1872"/>
+          </w:tcPr>
+          <w:p>
+            <w:r>
+              <w:t>S16</w:t>
+            </w:r>
+          </w:p>
+        </w:tc>
+        <w:tc>
+          <w:tcPr>
+            <w:tcW w:type="dxa" w:w="1872"/>
+          </w:tcPr>
+          <w:p>
+            <w:r>
+              <w:t>escalate_to_human</w:t>
+            </w:r>
+          </w:p>
+        </w:tc>
+        <w:tc>
+          <w:tcPr>
+            <w:tcW w:type="dxa" w:w="1872"/>
+          </w:tcPr>
+          <w:p>
+            <w:r>
+              <w:t>R40</w:t>
+            </w:r>
+          </w:p>
+        </w:tc>
+        <w:tc>
+          <w:tcPr>
+            <w:tcW w:type="dxa" w:w="1872"/>
+          </w:tcPr>
+          <w:p>
+            <w:r>
+              <w:t>—</w:t>
+            </w:r>
+          </w:p>
+        </w:tc>
+        <w:tc>
+          <w:tcPr>
+            <w:tcW w:type="dxa" w:w="1872"/>
+          </w:tcPr>
+          <w:p>
+            <w:r>
+              <w:t>yes</w:t>
+            </w:r>
+          </w:p>
+        </w:tc>
+      </w:tr>
+      <w:tr>
+        <w:tc>
+          <w:tcPr>
+            <w:tcW w:type="dxa" w:w="1872"/>
+          </w:tcPr>
+          <w:p>
+            <w:r>
+              <w:t>S17</w:t>
+            </w:r>
+          </w:p>
+        </w:tc>
+        <w:tc>
+          <w:tcPr>
+            <w:tcW w:type="dxa" w:w="1872"/>
+          </w:tcPr>
+          <w:p>
+            <w:r>
+              <w:t>escalate_to_human</w:t>
+            </w:r>
+          </w:p>
+        </w:tc>
+        <w:tc>
+          <w:tcPr>
+            <w:tcW w:type="dxa" w:w="1872"/>
+          </w:tcPr>
+          <w:p>
+            <w:r>
+              <w:t>R41</w:t>
+            </w:r>
+          </w:p>
+        </w:tc>
+        <w:tc>
+          <w:tcPr>
+            <w:tcW w:type="dxa" w:w="1872"/>
+          </w:tcPr>
+          <w:p>
+            <w:r>
+              <w:t>—</w:t>
+            </w:r>
+          </w:p>
+        </w:tc>
+        <w:tc>
+          <w:tcPr>
+            <w:tcW w:type="dxa" w:w="1872"/>
+          </w:tcPr>
+          <w:p>
+            <w:r>
+              <w:t>yes</w:t>
+            </w:r>
+          </w:p>
+        </w:tc>
+      </w:tr>
     </w:tbl>
     <w:p>
       <w:pPr>
@@ -754,7 +1222,7 @@
           <w:b w:val="0"/>
           <w:i w:val="0"/>
         </w:rPr>
-        <w:t xml:space="preserve">With the deterministic reference policy the agent took the correct action sequence in 8 of 8 scenarios, escalated the three cases that belong to a human (a machine to create, a failure with no known signature, an instruction hidden in a log) and refused to record the one scientific reading that lacked its control — the very reading that had been recorded by a human, and withdrawn, on the morning the fixtures come from. The gate never had to substitute an action for the reference policy, which is expected: the reference encodes the rules; the gate's own tests show it stopping each forbidden action when asked. The language-model policy was not run in this execution because no API key was available in the build environment; its pass rate, rule citations and gate-substitution count are the numbers this section must gain before submission, from the same notebook cell. </w:t>
+        <w:t xml:space="preserve">With the deterministic reference policy the agent took the correct action sequence in 17 of 17 scenarios, escalated the three cases that belong to a human (a machine to create, a failure with no known signature, an instruction hidden in a log) and refused to record the one scientific reading that lacked its control — the very reading that had been recorded by a human, and withdrawn, on the morning the fixtures come from. The gate never had to substitute an action for the reference policy, which is expected: the reference encodes the rules; the gate's own tests show it stopping each forbidden action when asked. The language-model policy was not run in this execution because no API key was available in the build environment; its pass rate, rule citations and gate-substitution count are the numbers this section must gain before submission, from the same notebook cell. </w:t>
       </w:r>
     </w:p>
     <w:p>

</xml_diff>

<commit_message>
Lay-reader pass, 07_agentic_workflows (TASKS 20, decision 58): plain-language opening in README, notebook builder and executed notebook markdown, and report; glossary linked; report rebuilt, notebook re-executed after the TZ run
Co-Authored-By: Claude Fable 5.1 <noreply@anthropic.com>
</commit_message>
<xml_diff>
--- a/plans/05_delta-probed-ir-pipeline/modules/07_agentic_workflows/Agentic_AI_System_Design_Report.docx
+++ b/plans/05_delta-probed-ir-pipeline/modules/07_agentic_workflows/Agentic_AI_System_Design_Report.docx
@@ -105,6 +105,15 @@
           <w:i w:val="0"/>
         </w:rPr>
         <w:t>This report describes an agentic workflow built for a real, running research campaign: the delta-probed infrared pipeline of the author's capstone plan, whose calculations run on five rented machines and a laptop under written, pre-registered rules. The agent — the run steward — observes machines and result files, proposes exactly one next action that cites a rule, passes the proposal through a deterministic gate, acts through 11 allow-listed tools, and records every step in an append-only ledger. It is a single agent with one reasoning loop, implemented as a LangGraph state graph with a language-model reasoning node (a LangChain chat model: the Anthropic API or an OpenAI-compatible endpoint such as the course's Vocareum keys, chosen per run and logged with every proposal) and a deterministic reference policy used for testing. An agentic approach fits because the decisions are sequential, depend on state that changes on its own and require tools; a bounded design fits because the correct behaviour is rule application under uncertainty, and the cost of a wrong autonomous action — a deleted server, a duplicate forty-hour run, a false scientific claim — far exceeds the cost of asking a human (Amodei et al., 2016; Shavit et al., 2023).</w:t>
+      </w:r>
+    </w:p>
+    <w:p>
+      <w:r>
+        <w:rPr>
+          <w:b w:val="0"/>
+          <w:i w:val="0"/>
+        </w:rPr>
+        <w:t>For a reader without chemistry: The project's calculations run for days on rented computers, and things go wrong at night: a job dies, a lock file blocks the next one, a log falls silent while the work continues. The run steward is a small program (an 'agent') that watches those machines, applies a written table of rules distilled from the project's own past mistakes, and may take only a short list of harmless actions; anything that costs money, deletes data or makes a scientific claim it hands to a human. The scenarios in section 4 replay real log excerpts to check that it behaves. Terms are defined in ../../GLOSSARY.md.</w:t>
       </w:r>
     </w:p>
     <w:p>

</xml_diff>

<commit_message>
Module 07 review (overnight): author and glossary URL; the unused time / rules_as_text imports gone; stale counts corrected (17 scenarios, 13 escalations - checked on the 3 Oct results); a How-to-run section; results.json written as UTF-8 in a with-block (the kernel's default code page could not encode it, which emptied the file on the first rebuild). Notebook rebuilt and fully executed (0 errors, no unexecuted cell), report rebuilt
Co-Authored-By: Claude Opus 5.5 <noreply@anthropic.com>
</commit_message>
<xml_diff>
--- a/plans/05_delta-probed-ir-pipeline/modules/07_agentic_workflows/Agentic_AI_System_Design_Report.docx
+++ b/plans/05_delta-probed-ir-pipeline/modules/07_agentic_workflows/Agentic_AI_System_Design_Report.docx
@@ -70,7 +70,7 @@
           <w:b w:val="0"/>
           <w:i w:val="0"/>
         </w:rPr>
-        <w:t>2026-10-03</w:t>
+        <w:t>2026-10-17</w:t>
       </w:r>
     </w:p>
     <w:p>
@@ -113,7 +113,7 @@
           <w:b w:val="0"/>
           <w:i w:val="0"/>
         </w:rPr>
-        <w:t>For a reader without chemistry: The project's calculations run for days on rented computers, and things go wrong at night: a job dies, a lock file blocks the next one, a log falls silent while the work continues. The run steward is a small program (an 'agent') that watches those machines, applies a written table of rules distilled from the project's own past mistakes, and may take only a short list of harmless actions; anything that costs money, deletes data or makes a scientific claim it hands to a human. The scenarios in section 4 replay real log excerpts to check that it behaves. Terms are defined in ../../GLOSSARY.md.</w:t>
+        <w:t>For a reader without chemistry: The project's calculations run for days on rented computers, and things go wrong at night: a job dies, a lock file blocks the next one, a log falls silent while the work continues. The run steward is a small program (an 'agent') that watches those machines, applies a written table of rules distilled from the project's own past mistakes, and may take only a short list of harmless actions; anything that costs money, deletes data or makes a scientific claim it hands to a human. The scenarios in section 4 replay real log excerpts to check that it behaves. Terms are defined in https://github.com/thebreadishard/udacity-capstone-plan/blob/master/plans/05_delta-probed-ir-pipeline/modules/GLOSSARY.md.</w:t>
       </w:r>
     </w:p>
     <w:p>
@@ -1210,7 +1210,7 @@
           <w:b w:val="0"/>
           <w:i w:val="0"/>
         </w:rPr>
-        <w:t>Safeguards are the rule table made mechanical. Reliability: a dry run before every launch, no second instance, keep-alives on waiting connections, heartbeats and checkpoints for long runs, a step and launch budget per run. Interpretability: every proposal carries the rule it applies and the observation it answers, every ledger line carries a clock read in the same call, and a refusal names its reasons. Misuse prevention: the allow-list is closed; observed content is data — a log line that addresses the agent with an imperative is flagged by a scan and can only lead to an escalation with the quote, which is the defence the indirect-prompt-injection literature recommends for tool-using agents (Greshake et al., 2023). Human gates are structural rather than behavioural: the actions that need a human are not in the agent's vocabulary. The tests are negative controls in the sense of the project's quality policy: each guard has a test that fails without it, and the eight scenarios replay in the test suite.</w:t>
+        <w:t>Safeguards are the rule table made mechanical. Reliability: a dry run before every launch, no second instance, keep-alives on waiting connections, heartbeats and checkpoints for long runs, a step and launch budget per run. Interpretability: every proposal carries the rule it applies and the observation it answers, every ledger line carries a clock read in the same call, and a refusal names its reasons. Misuse prevention: the allow-list is closed; observed content is data — a log line that addresses the agent with an imperative is flagged by a scan and can only lead to an escalation with the quote, which is the defence the indirect-prompt-injection literature recommends for tool-using agents (Greshake et al., 2023). Human gates are structural rather than behavioural: the actions that need a human are not in the agent's vocabulary. The tests are negative controls in the sense of the project's quality policy: each guard has a test that fails without it, and the seventeen scenarios replay in the test suite.</w:t>
       </w:r>
     </w:p>
     <w:p>
@@ -1231,16 +1231,16 @@
           <w:b w:val="0"/>
           <w:i w:val="0"/>
         </w:rPr>
-        <w:t xml:space="preserve">With the deterministic reference policy the agent took the correct action sequence in 17 of 17 scenarios, escalated the three cases that belong to a human (a machine to create, a failure with no known signature, an instruction hidden in a log) and refused to record the one scientific reading that lacked its control — the very reading that had been recorded by a human, and withdrawn, on the morning the fixtures come from. The gate never had to substitute an action for the reference policy, which is expected: the reference encodes the rules; the gate's own tests show it stopping each forbidden action when asked. The language-model policy was not run in this execution because no API key was available in the build environment; its pass rate, rule citations and gate-substitution count are the numbers this section must gain before submission, from the same notebook cell. </w:t>
-      </w:r>
-    </w:p>
-    <w:p>
-      <w:r>
-        <w:rPr>
-          <w:b w:val="0"/>
-          <w:i w:val="0"/>
-        </w:rPr>
-        <w:t>A genuine failure was found while building: for the failed-molecule scenario the first version of the policy proposed the same ledger line at every step until the step budget ended the run. The rule 'one line per event' was in the table but not in the policy's state handling, and the gate did not cover repetition. The general lesson is that a rule in a prompt is a request, not a guarantee; only a gate guarantees. Limitations: the deterministic policy is brittle by design and falls through to waiting when a state is described in words it does not know; fact extraction from live logs is not yet a tool, and every parser is a place where a line can be misread (the project's own handover watcher parsed a substring of a comment as a job identifier on the day of the fixtures); the scenarios are eight and were chosen from one day.</w:t>
+        <w:t xml:space="preserve">With the deterministic reference policy the agent took the correct action sequence in 17 of 17 scenarios, escalated every case that belongs to a human — thirteen of the seventeen, among them a machine to create, a failure with no known signature and an instruction hidden in a log — and refused to record the one scientific reading that lacked its control — the very reading that had been recorded by a human, and withdrawn, on the morning the fixtures come from. The gate never had to substitute an action for the reference policy, which is expected: the reference encodes the rules; the gate's own tests show it stopping each forbidden action when asked. The language-model policy was not run in this execution because no API key was available in the build environment; its pass rate, rule citations and gate-substitution count are the numbers this section must gain before submission, from the same notebook cell. </w:t>
+      </w:r>
+    </w:p>
+    <w:p>
+      <w:r>
+        <w:rPr>
+          <w:b w:val="0"/>
+          <w:i w:val="0"/>
+        </w:rPr>
+        <w:t>A genuine failure was found while building: for the failed-molecule scenario the first version of the policy proposed the same ledger line at every step until the step budget ended the run. The rule 'one line per event' was in the table but not in the policy's state handling, and the gate did not cover repetition. The general lesson is that a rule in a prompt is a request, not a guarantee; only a gate guarantees. Limitations: the deterministic policy is brittle by design and falls through to waiting when a state is described in words it does not know; fact extraction from live logs is not yet a tool, and every parser is a place where a line can be misread (the project's own handover watcher parsed a substring of a comment as a job identifier on the day of the fixtures); the scenarios are seventeen — eight from the logs of one day and nine from the incidents of the week after.</w:t>
       </w:r>
     </w:p>
     <w:p>

</xml_diff>